<commit_message>
Journal through Oct 12; workbook refreshed; keep the journal's node library local
Co-Authored-By: Claude Fable 5.1 <noreply@anthropic.com>
</commit_message>
<xml_diff>
--- a/Pricing-October-Journals.docx
+++ b/Pricing-October-Journals.docx
@@ -3177,6 +3177,318 @@
           <w:szCs w:val="21"/>
         </w:rPr>
         <w:t xml:space="preserve">Have SQLBolt 7–12 finished tonight.</w:t>
+      </w:r>
+    </w:p>
+    <w:p>
+      <w:pPr>
+        <w:pStyle w:val="Heading1"/>
+        <w:spacing w:after="120" w:before="360"/>
+      </w:pPr>
+      <w:r>
+        <w:rPr>
+          <w:rFonts w:ascii="Calibri" w:cs="Calibri" w:eastAsia="Calibri" w:hAnsi="Calibri"/>
+          <w:color w:val="0B1F3A"/>
+        </w:rPr>
+        <w:t xml:space="preserve">Thu Oct 8 – Mon Oct 12 · Division Series close, LCS open, the SQL gets written</w:t>
+      </w:r>
+    </w:p>
+    <w:p>
+      <w:pPr>
+        <w:pStyle w:val="Heading2"/>
+        <w:spacing w:after="60" w:before="200"/>
+      </w:pPr>
+      <w:r>
+        <w:rPr>
+          <w:rFonts w:ascii="Calibri" w:cs="Calibri" w:eastAsia="Calibri" w:hAnsi="Calibri"/>
+          <w:color w:val="C9962B"/>
+        </w:rPr>
+        <w:t xml:space="preserve">What happened</w:t>
+      </w:r>
+    </w:p>
+    <w:p>
+      <w:pPr>
+        <w:pStyle w:val="ListParagraph"/>
+        <w:numPr>
+          <w:ilvl w:val="0"/>
+          <w:numId w:val="2"/>
+        </w:numPr>
+        <w:spacing w:after="40"/>
+      </w:pPr>
+      <w:r>
+        <w:rPr>
+          <w:rFonts w:ascii="Calibri" w:cs="Calibri" w:eastAsia="Calibri" w:hAnsi="Calibri"/>
+          <w:sz w:val="21"/>
+          <w:szCs w:val="21"/>
+        </w:rPr>
+        <w:t xml:space="preserve">Pipeline: 148 of 148 runs green across five days, 126 distinct hours with a run. Nothing missed. 671 captures, 819,753 listings, ~330 credits left (renews Oct 28).</w:t>
+      </w:r>
+    </w:p>
+    <w:p>
+      <w:pPr>
+        <w:pStyle w:val="ListParagraph"/>
+        <w:numPr>
+          <w:ilvl w:val="0"/>
+          <w:numId w:val="2"/>
+        </w:numPr>
+        <w:spacing w:after="40"/>
+      </w:pPr>
+      <w:r>
+        <w:rPr>
+          <w:rFonts w:ascii="Calibri" w:cs="Calibri" w:eastAsia="Calibri" w:hAnsi="Calibri"/>
+          <w:sz w:val="21"/>
+          <w:szCs w:val="21"/>
+        </w:rPr>
+        <w:t xml:space="preserve">Results logged through NLCS Game 1 (results.csv at 33 rows). Rays swept the Yankees 3–0 (Game 3 4–3 at Yankee Stadium). Guardians came back from 0–2 to beat the White Sox 3–2 (9–3, 9–5, then 2–0 at home). Dodgers over Braves 3–1. Brewers over Padres 3–1. NLCS: Brewers 2–1 Dodgers in Game 1. ALCS Rays–Guardians opens tonight.</w:t>
+      </w:r>
+    </w:p>
+    <w:p>
+      <w:pPr>
+        <w:pStyle w:val="ListParagraph"/>
+        <w:numPr>
+          <w:ilvl w:val="0"/>
+          <w:numId w:val="2"/>
+        </w:numPr>
+        <w:spacing w:after="40"/>
+      </w:pPr>
+      <w:r>
+        <w:rPr>
+          <w:rFonts w:ascii="Calibri" w:cs="Calibri" w:eastAsia="Calibri" w:hAnsi="Calibri"/>
+          <w:sz w:val="21"/>
+          <w:szCs w:val="21"/>
+        </w:rPr>
+        <w:t xml:space="preserve">Claude wrote the analysis layer so I can read working queries on my own data instead of toy tables: analysis/00–06 (health, decay curve, rivalry premium, if-necessary, series state, elimination games, window-function velocity) plus run_all.py to execute them. Each file has the question and a plain-English walkthrough at the top and the answer at the bottom.</w:t>
+      </w:r>
+    </w:p>
+    <w:p>
+      <w:pPr>
+        <w:pStyle w:val="ListParagraph"/>
+        <w:numPr>
+          <w:ilvl w:val="0"/>
+          <w:numId w:val="2"/>
+        </w:numPr>
+        <w:spacing w:after="40"/>
+      </w:pPr>
+      <w:r>
+        <w:rPr>
+          <w:rFonts w:ascii="Calibri" w:cs="Calibri" w:eastAsia="Calibri" w:hAnsi="Calibri"/>
+          <w:sz w:val="21"/>
+          <w:szCs w:val="21"/>
+        </w:rPr>
+        <w:t xml:space="preserve">Database got two helper views: `resale` now carries round, game number, if-necessary and TBD flags parsed from the title; `game_results` joins every capture to the results table so a query can ask ‘did the home team win the previous game?’ without string gymnastics. Plus a `teams` lookup table.</w:t>
+      </w:r>
+    </w:p>
+    <w:p>
+      <w:pPr>
+        <w:pStyle w:val="ListParagraph"/>
+        <w:numPr>
+          <w:ilvl w:val="0"/>
+          <w:numId w:val="2"/>
+        </w:numPr>
+        <w:spacing w:after="40"/>
+      </w:pPr>
+      <w:r>
+        <w:rPr>
+          <w:rFonts w:ascii="Calibri" w:cs="Calibri" w:eastAsia="Calibri" w:hAnsi="Calibri"/>
+          <w:sz w:val="21"/>
+          <w:szCs w:val="21"/>
+        </w:rPr>
+        <w:t xml:space="preserve">A real SQL lesson surfaced: the view has a column named `bucket`, and a query alias with the same name silently grouped by the wrong thing. Aliases must not shadow columns.</w:t>
+      </w:r>
+    </w:p>
+    <w:p>
+      <w:pPr>
+        <w:pStyle w:val="Heading2"/>
+        <w:spacing w:after="60" w:before="200"/>
+      </w:pPr>
+      <w:r>
+        <w:rPr>
+          <w:rFonts w:ascii="Calibri" w:cs="Calibri" w:eastAsia="Calibri" w:hAnsi="Calibri"/>
+          <w:color w:val="C9962B"/>
+        </w:rPr>
+        <w:t xml:space="preserve">What the data says</w:t>
+      </w:r>
+    </w:p>
+    <w:p>
+      <w:pPr>
+        <w:pStyle w:val="ListParagraph"/>
+        <w:numPr>
+          <w:ilvl w:val="0"/>
+          <w:numId w:val="2"/>
+        </w:numPr>
+        <w:spacing w:after="40"/>
+      </w:pPr>
+      <w:r>
+        <w:rPr>
+          <w:rFonts w:ascii="Calibri" w:cs="Calibri" w:eastAsia="Calibri" w:hAnsi="Calibri"/>
+          <w:sz w:val="21"/>
+          <w:szCs w:val="21"/>
+        </w:rPr>
+        <w:t xml:space="preserve">Decay curve: Wild Card get-in $72 at 24–48 h → $29 in the final hour; Division Series $132 → $106. Prices fall into first pitch in every round, listings thin by two-thirds, and the last hour is the cheapest hour.</w:t>
+      </w:r>
+    </w:p>
+    <w:p>
+      <w:pPr>
+        <w:pStyle w:val="ListParagraph"/>
+        <w:numPr>
+          <w:ilvl w:val="0"/>
+          <w:numId w:val="2"/>
+        </w:numPr>
+        <w:spacing w:after="40"/>
+      </w:pPr>
+      <w:r>
+        <w:rPr>
+          <w:rFonts w:ascii="Calibri" w:cs="Calibri" w:eastAsia="Calibri" w:hAnsi="Calibri"/>
+          <w:sz w:val="21"/>
+          <w:szCs w:val="21"/>
+        </w:rPr>
+        <w:t xml:space="preserve">Rivalry premium: Yankees–Red Sox Game 1 traded at 2.3× the other Wild Card hosts’ get-in 32 hours out and 3.4× at 9 hours out. The gap widened; the others cut to clear, New York didn’t have to.</w:t>
+      </w:r>
+    </w:p>
+    <w:p>
+      <w:pPr>
+        <w:pStyle w:val="ListParagraph"/>
+        <w:numPr>
+          <w:ilvl w:val="0"/>
+          <w:numId w:val="2"/>
+        </w:numPr>
+        <w:spacing w:after="40"/>
+      </w:pPr>
+      <w:r>
+        <w:rPr>
+          <w:rFonts w:ascii="Calibri" w:cs="Calibri" w:eastAsia="Calibri" w:hAnsi="Calibri"/>
+          <w:sz w:val="21"/>
+          <w:szCs w:val="21"/>
+        </w:rPr>
+        <w:t xml:space="preserve">If-necessary: there is NO discount versus Game 1. Maybe-games traded at par or above (Yankees +17%, Astros +56%, Brewers G5 +27%) because stakes rise through a series. The discount shows only within a game, before versus after confirmation: the Braves’ forced Game 3 went +21% → +66% → +174% versus Game 1 once it became real. Framing for the memo: uncertainty is priced as a delay, not a discount.</w:t>
+      </w:r>
+    </w:p>
+    <w:p>
+      <w:pPr>
+        <w:pStyle w:val="ListParagraph"/>
+        <w:numPr>
+          <w:ilvl w:val="0"/>
+          <w:numId w:val="2"/>
+        </w:numPr>
+        <w:spacing w:after="40"/>
+      </w:pPr>
+      <w:r>
+        <w:rPr>
+          <w:rFonts w:ascii="Calibri" w:cs="Calibri" w:eastAsia="Calibri" w:hAnsi="Calibri"/>
+          <w:sz w:val="21"/>
+          <w:szCs w:val="21"/>
+        </w:rPr>
+        <w:t xml:space="preserve">Series state: after a home loss, the next home game’s median fell ~26% on average; after a home win, ~10%. Bad news moves prices 2.5× more than good news.</w:t>
+      </w:r>
+    </w:p>
+    <w:p>
+      <w:pPr>
+        <w:pStyle w:val="ListParagraph"/>
+        <w:numPr>
+          <w:ilvl w:val="0"/>
+          <w:numId w:val="2"/>
+        </w:numPr>
+        <w:spacing w:after="40"/>
+      </w:pPr>
+      <w:r>
+        <w:rPr>
+          <w:rFonts w:ascii="Calibri" w:cs="Calibri" w:eastAsia="Calibri" w:hAnsi="Calibri"/>
+          <w:sz w:val="21"/>
+          <w:szCs w:val="21"/>
+        </w:rPr>
+        <w:t xml:space="preserve">Elimination games are priced like ordinary games; the clincher is the premium (+130% in the DS), though both DS clinchers were in Chicago, so the LCS has to separate clinch from market.</w:t>
+      </w:r>
+    </w:p>
+    <w:p>
+      <w:pPr>
+        <w:pStyle w:val="ListParagraph"/>
+        <w:numPr>
+          <w:ilvl w:val="0"/>
+          <w:numId w:val="2"/>
+        </w:numPr>
+        <w:spacing w:after="40"/>
+      </w:pPr>
+      <w:r>
+        <w:rPr>
+          <w:rFonts w:ascii="Calibri" w:cs="Calibri" w:eastAsia="Calibri" w:hAnsi="Calibri"/>
+          <w:sz w:val="21"/>
+          <w:szCs w:val="21"/>
+        </w:rPr>
+        <w:t xml:space="preserve">Velocity: the fastest listing drops all come in the final 6 hours and arrive with falling medians. Listings vanish because sellers cut and clear, not because buyers bid up. Listing count is a supply signal.</w:t>
+      </w:r>
+    </w:p>
+    <w:p>
+      <w:pPr>
+        <w:pStyle w:val="Heading2"/>
+        <w:spacing w:after="60" w:before="200"/>
+      </w:pPr>
+      <w:r>
+        <w:rPr>
+          <w:rFonts w:ascii="Calibri" w:cs="Calibri" w:eastAsia="Calibri" w:hAnsi="Calibri"/>
+          <w:color w:val="C9962B"/>
+        </w:rPr>
+        <w:t xml:space="preserve">Status</w:t>
+      </w:r>
+    </w:p>
+    <w:p>
+      <w:pPr>
+        <w:spacing w:after="80"/>
+      </w:pPr>
+      <w:r>
+        <w:rPr>
+          <w:rFonts w:ascii="Calibri" w:cs="Calibri" w:eastAsia="Calibri" w:hAnsi="Calibri"/>
+          <w:sz w:val="21"/>
+          <w:szCs w:val="21"/>
+        </w:rPr>
+        <w:t xml:space="preserve">Division Series complete. LCS: Brewers lead Dodgers 1–0; Rays–Guardians Game 1 tonight. Queries 0–6 written and answered; the regression (Q7) and the Tableau dashboard are next, on the blueprint’s dates.</w:t>
+      </w:r>
+    </w:p>
+    <w:p>
+      <w:pPr>
+        <w:pStyle w:val="Heading2"/>
+        <w:spacing w:after="60" w:before="200"/>
+      </w:pPr>
+      <w:r>
+        <w:rPr>
+          <w:rFonts w:ascii="Calibri" w:cs="Calibri" w:eastAsia="Calibri" w:hAnsi="Calibri"/>
+          <w:color w:val="C9962B"/>
+        </w:rPr>
+        <w:t xml:space="preserve">Me, this week</w:t>
+      </w:r>
+    </w:p>
+    <w:p>
+      <w:pPr>
+        <w:pStyle w:val="ListParagraph"/>
+        <w:numPr>
+          <w:ilvl w:val="0"/>
+          <w:numId w:val="2"/>
+        </w:numPr>
+        <w:spacing w:after="40"/>
+      </w:pPr>
+      <w:r>
+        <w:rPr>
+          <w:rFonts w:ascii="Calibri" w:cs="Calibri" w:eastAsia="Calibri" w:hAnsi="Calibri"/>
+          <w:sz w:val="21"/>
+          <w:szCs w:val="21"/>
+        </w:rPr>
+        <w:t xml:space="preserve">SQL: finish SQLBolt and Kaggle Intro by Friday. Then run `python3 analysis/run_all.py`, read each file top to bottom, and change one thing in each query to see what moves. That is the manual work from Friday on.</w:t>
+      </w:r>
+    </w:p>
+    <w:p>
+      <w:pPr>
+        <w:pStyle w:val="ListParagraph"/>
+        <w:numPr>
+          <w:ilvl w:val="0"/>
+          <w:numId w:val="2"/>
+        </w:numPr>
+        <w:spacing w:after="40"/>
+      </w:pPr>
+      <w:r>
+        <w:rPr>
+          <w:rFonts w:ascii="Calibri" w:cs="Calibri" w:eastAsia="Calibri" w:hAnsi="Calibri"/>
+          <w:sz w:val="21"/>
+          <w:szCs w:val="21"/>
+        </w:rPr>
+        <w:t xml:space="preserve">Paper bracket.</w:t>
       </w:r>
     </w:p>
     <w:sectPr>
@@ -3391,6 +3703,21 @@
   <w:style w:type="paragraph" w:styleId="Normal" w:default="1">
     <w:name w:val="Normal"/>
     <w:qFormat/>
+  </w:style>
+  <w:style w:type="table" w:styleId="TableNormal" w:default="true">
+    <w:name w:val="Normal Table"/>
+    <w:uiPriority w:val="99"/>
+    <w:semiHidden/>
+    <w:unhideWhenUsed/>
+    <w:tblPr>
+      <w:tblInd w:type="dxa" w:w="0"/>
+      <w:tblCellMar>
+        <w:top w:type="dxa" w:w="0"/>
+        <w:left w:type="dxa" w:w="108"/>
+        <w:bottom w:type="dxa" w:w="0"/>
+        <w:right w:type="dxa" w:w="108"/>
+      </w:tblCellMar>
+    </w:tblPr>
   </w:style>
   <w:style w:type="paragraph" w:styleId="Title">
     <w:name w:val="Title"/>

</xml_diff>

<commit_message>
Journal: Oct 14–22, scope decision; workbook refreshed
Co-Authored-By: Claude Fable 5.1 <noreply@anthropic.com>
</commit_message>
<xml_diff>
--- a/Pricing-October-Journals.docx
+++ b/Pricing-October-Journals.docx
@@ -3711,6 +3711,697 @@
           <w:szCs w:val="21"/>
         </w:rPr>
         <w:t xml:space="preserve">Results for NLCS Game 3 and ALCS Game 2.</w:t>
+      </w:r>
+    </w:p>
+    <w:p>
+      <w:pPr>
+        <w:pStyle w:val="Heading1"/>
+        <w:spacing w:after="120" w:before="360"/>
+      </w:pPr>
+      <w:r>
+        <w:rPr>
+          <w:rFonts w:ascii="Calibri" w:cs="Calibri" w:eastAsia="Calibri" w:hAnsi="Calibri"/>
+          <w:color w:val="0B1F3A"/>
+        </w:rPr>
+        <w:t xml:space="preserve">Wed Oct 14 – Thu Oct 22 · LCS, the World Series matchup, and a decision</w:t>
+      </w:r>
+    </w:p>
+    <w:p>
+      <w:pPr>
+        <w:pStyle w:val="Heading2"/>
+        <w:spacing w:after="60" w:before="200"/>
+      </w:pPr>
+      <w:r>
+        <w:rPr>
+          <w:rFonts w:ascii="Calibri" w:cs="Calibri" w:eastAsia="Calibri" w:hAnsi="Calibri"/>
+          <w:color w:val="C9962B"/>
+        </w:rPr>
+        <w:t xml:space="preserve">What happened</w:t>
+      </w:r>
+    </w:p>
+    <w:p>
+      <w:pPr>
+        <w:pStyle w:val="ListParagraph"/>
+        <w:numPr>
+          <w:ilvl w:val="0"/>
+          <w:numId w:val="2"/>
+        </w:numPr>
+        <w:spacing w:after="40"/>
+      </w:pPr>
+      <w:r>
+        <w:rPr>
+          <w:rFonts w:ascii="Calibri" w:cs="Calibri" w:eastAsia="Calibri" w:hAnsi="Calibri"/>
+          <w:sz w:val="21"/>
+          <w:szCs w:val="21"/>
+        </w:rPr>
+        <w:t xml:space="preserve">Pipeline: 237 of 237 runs green across nine days. It has not needed a hand since Oct 7.</w:t>
+      </w:r>
+    </w:p>
+    <w:p>
+      <w:pPr>
+        <w:pStyle w:val="ListParagraph"/>
+        <w:numPr>
+          <w:ilvl w:val="0"/>
+          <w:numId w:val="2"/>
+        </w:numPr>
+        <w:spacing w:after="40"/>
+      </w:pPr>
+      <w:r>
+        <w:rPr>
+          <w:rFonts w:ascii="Calibri" w:cs="Calibri" w:eastAsia="Calibri" w:hAnsi="Calibri"/>
+          <w:sz w:val="21"/>
+          <w:szCs w:val="21"/>
+        </w:rPr>
+        <w:t xml:space="preserve">Results logged through the ALCS (results.csv at 46 rows). Brewers swept the Dodgers 4–0 (first World Series since 1982; defending champs out). Rays beat the Guardians 4–2, clinching 7–3 in Game 6. World Series: Rays at Brewers, Game 1 Oct 23 in Milwaukee.</w:t>
+      </w:r>
+    </w:p>
+    <w:p>
+      <w:pPr>
+        <w:pStyle w:val="ListParagraph"/>
+        <w:numPr>
+          <w:ilvl w:val="0"/>
+          <w:numId w:val="2"/>
+        </w:numPr>
+        <w:spacing w:after="40"/>
+      </w:pPr>
+      <w:r>
+        <w:rPr>
+          <w:rFonts w:ascii="Calibri" w:cs="Calibri" w:eastAsia="Calibri" w:hAnsi="Calibri"/>
+          <w:sz w:val="21"/>
+          <w:szCs w:val="21"/>
+        </w:rPr>
+        <w:t xml:space="preserve">Decision: with school taking priority, I’m not learning SQL this fall. This project becomes a data-collection project for now; the analysis happens when I pick up SQL. I cancelled the tickets.dev renewal (Oct 28), so resale captures end around Oct 27 after World Series Games 1–3. The free SeatGeek and Ticketmaster snapshots keep running through the end of the Series.</w:t>
+      </w:r>
+    </w:p>
+    <w:p>
+      <w:pPr>
+        <w:pStyle w:val="Heading2"/>
+        <w:spacing w:after="60" w:before="200"/>
+      </w:pPr>
+      <w:r>
+        <w:rPr>
+          <w:rFonts w:ascii="Calibri" w:cs="Calibri" w:eastAsia="Calibri" w:hAnsi="Calibri"/>
+          <w:color w:val="C9962B"/>
+        </w:rPr>
+        <w:t xml:space="preserve">What the data says</w:t>
+      </w:r>
+    </w:p>
+    <w:p>
+      <w:pPr>
+        <w:pStyle w:val="ListParagraph"/>
+        <w:numPr>
+          <w:ilvl w:val="0"/>
+          <w:numId w:val="2"/>
+        </w:numPr>
+        <w:spacing w:after="40"/>
+      </w:pPr>
+      <w:r>
+        <w:rPr>
+          <w:rFonts w:ascii="Calibri" w:cs="Calibri" w:eastAsia="Calibri" w:hAnsi="Calibri"/>
+          <w:sz w:val="21"/>
+          <w:szCs w:val="21"/>
+        </w:rPr>
+        <w:t xml:space="preserve">The Dodgers’ elimination game in a 56,000-seat stadium decayed hard (get-in $92 → $70, median $223 → $101, 2,368 → 541 listings). Milwaukee’s sellout went the other way the same week. One variable decides the curve: whether the inventory clears.</w:t>
+      </w:r>
+    </w:p>
+    <w:p>
+      <w:pPr>
+        <w:pStyle w:val="ListParagraph"/>
+        <w:numPr>
+          <w:ilvl w:val="0"/>
+          <w:numId w:val="2"/>
+        </w:numPr>
+        <w:spacing w:after="40"/>
+      </w:pPr>
+      <w:r>
+        <w:rPr>
+          <w:rFonts w:ascii="Calibri" w:cs="Calibri" w:eastAsia="Calibri" w:hAnsi="Calibri"/>
+          <w:sz w:val="21"/>
+          <w:szCs w:val="21"/>
+        </w:rPr>
+        <w:t xml:space="preserve">The World Series opener in Milwaukee listed at a $2,836 get-in and $4,545 median three days out, with ~250 listings. The cheapest Wild Card ticket three weeks earlier was $18.</w:t>
+      </w:r>
+    </w:p>
+    <w:p>
+      <w:pPr>
+        <w:pStyle w:val="Heading2"/>
+        <w:spacing w:after="60" w:before="200"/>
+      </w:pPr>
+      <w:r>
+        <w:rPr>
+          <w:rFonts w:ascii="Calibri" w:cs="Calibri" w:eastAsia="Calibri" w:hAnsi="Calibri"/>
+          <w:color w:val="C9962B"/>
+        </w:rPr>
+        <w:t xml:space="preserve">The dataset, as it stands</w:t>
+      </w:r>
+    </w:p>
+    <w:tbl>
+      <w:tblPr>
+        <w:tblW w:type="dxa" w:w="9360"/>
+        <w:tblBorders>
+          <w:top w:val="single" w:color="auto" w:sz="4"/>
+          <w:left w:val="single" w:color="auto" w:sz="4"/>
+          <w:bottom w:val="single" w:color="auto" w:sz="4"/>
+          <w:right w:val="single" w:color="auto" w:sz="4"/>
+          <w:insideH w:val="single" w:color="auto" w:sz="4"/>
+          <w:insideV w:val="single" w:color="auto" w:sz="4"/>
+        </w:tblBorders>
+      </w:tblPr>
+      <w:tblGrid>
+        <w:gridCol w:w="6000"/>
+        <w:gridCol w:w="3360"/>
+      </w:tblGrid>
+      <w:tr>
+        <w:trPr>
+          <w:tblHeader/>
+        </w:trPr>
+        <w:tc>
+          <w:tcPr>
+            <w:tcW w:type="dxa" w:w="6000"/>
+            <w:shd w:fill="0B1F3A" w:color="auto" w:val="clear"/>
+            <w:tcMar>
+              <w:top w:type="dxa" w:w="60"/>
+              <w:left w:type="dxa" w:w="100"/>
+              <w:bottom w:type="dxa" w:w="60"/>
+              <w:right w:type="dxa" w:w="100"/>
+            </w:tcMar>
+          </w:tcPr>
+          <w:p>
+            <w:r>
+              <w:rPr>
+                <w:rFonts w:ascii="Calibri" w:cs="Calibri" w:eastAsia="Calibri" w:hAnsi="Calibri"/>
+                <w:b/>
+                <w:bCs/>
+                <w:color w:val="FFFFFF"/>
+                <w:sz w:val="19"/>
+                <w:szCs w:val="19"/>
+              </w:rPr>
+              <w:t xml:space="preserve">What</w:t>
+            </w:r>
+          </w:p>
+        </w:tc>
+        <w:tc>
+          <w:tcPr>
+            <w:tcW w:type="dxa" w:w="3360"/>
+            <w:shd w:fill="0B1F3A" w:color="auto" w:val="clear"/>
+            <w:tcMar>
+              <w:top w:type="dxa" w:w="60"/>
+              <w:left w:type="dxa" w:w="100"/>
+              <w:bottom w:type="dxa" w:w="60"/>
+              <w:right w:type="dxa" w:w="100"/>
+            </w:tcMar>
+          </w:tcPr>
+          <w:p>
+            <w:r>
+              <w:rPr>
+                <w:rFonts w:ascii="Calibri" w:cs="Calibri" w:eastAsia="Calibri" w:hAnsi="Calibri"/>
+                <w:b/>
+                <w:bCs/>
+                <w:color w:val="FFFFFF"/>
+                <w:sz w:val="19"/>
+                <w:szCs w:val="19"/>
+              </w:rPr>
+              <w:t xml:space="preserve">Count</w:t>
+            </w:r>
+          </w:p>
+        </w:tc>
+      </w:tr>
+      <w:tr>
+        <w:tc>
+          <w:tcPr>
+            <w:tcW w:type="dxa" w:w="6000"/>
+            <w:tcMar>
+              <w:top w:type="dxa" w:w="60"/>
+              <w:left w:type="dxa" w:w="100"/>
+              <w:bottom w:type="dxa" w:w="60"/>
+              <w:right w:type="dxa" w:w="100"/>
+            </w:tcMar>
+          </w:tcPr>
+          <w:p>
+            <w:r>
+              <w:rPr>
+                <w:rFonts w:ascii="Calibri" w:cs="Calibri" w:eastAsia="Calibri" w:hAnsi="Calibri"/>
+                <w:b w:val="false"/>
+                <w:bCs w:val="false"/>
+                <w:sz w:val="19"/>
+                <w:szCs w:val="19"/>
+              </w:rPr>
+              <w:t xml:space="preserve">Resale captures (one price snapshot of one game)</w:t>
+            </w:r>
+          </w:p>
+        </w:tc>
+        <w:tc>
+          <w:tcPr>
+            <w:tcW w:type="dxa" w:w="3360"/>
+            <w:tcMar>
+              <w:top w:type="dxa" w:w="60"/>
+              <w:left w:type="dxa" w:w="100"/>
+              <w:bottom w:type="dxa" w:w="60"/>
+              <w:right w:type="dxa" w:w="100"/>
+            </w:tcMar>
+          </w:tcPr>
+          <w:p>
+            <w:r>
+              <w:rPr>
+                <w:rFonts w:ascii="Calibri" w:cs="Calibri" w:eastAsia="Calibri" w:hAnsi="Calibri"/>
+                <w:b w:val="false"/>
+                <w:bCs w:val="false"/>
+                <w:sz w:val="19"/>
+                <w:szCs w:val="19"/>
+              </w:rPr>
+              <w:t xml:space="preserve">738</w:t>
+            </w:r>
+          </w:p>
+        </w:tc>
+      </w:tr>
+      <w:tr>
+        <w:tc>
+          <w:tcPr>
+            <w:tcW w:type="dxa" w:w="6000"/>
+            <w:tcMar>
+              <w:top w:type="dxa" w:w="60"/>
+              <w:left w:type="dxa" w:w="100"/>
+              <w:bottom w:type="dxa" w:w="60"/>
+              <w:right w:type="dxa" w:w="100"/>
+            </w:tcMar>
+          </w:tcPr>
+          <w:p>
+            <w:r>
+              <w:rPr>
+                <w:rFonts w:ascii="Calibri" w:cs="Calibri" w:eastAsia="Calibri" w:hAnsi="Calibri"/>
+                <w:b w:val="false"/>
+                <w:bCs w:val="false"/>
+                <w:sz w:val="19"/>
+                <w:szCs w:val="19"/>
+              </w:rPr>
+              <w:t xml:space="preserve">Individual listings (section, row, price, fees)</w:t>
+            </w:r>
+          </w:p>
+        </w:tc>
+        <w:tc>
+          <w:tcPr>
+            <w:tcW w:type="dxa" w:w="3360"/>
+            <w:tcMar>
+              <w:top w:type="dxa" w:w="60"/>
+              <w:left w:type="dxa" w:w="100"/>
+              <w:bottom w:type="dxa" w:w="60"/>
+              <w:right w:type="dxa" w:w="100"/>
+            </w:tcMar>
+          </w:tcPr>
+          <w:p>
+            <w:r>
+              <w:rPr>
+                <w:rFonts w:ascii="Calibri" w:cs="Calibri" w:eastAsia="Calibri" w:hAnsi="Calibri"/>
+                <w:b w:val="false"/>
+                <w:bCs w:val="false"/>
+                <w:sz w:val="19"/>
+                <w:szCs w:val="19"/>
+              </w:rPr>
+              <w:t xml:space="preserve">871,409</w:t>
+            </w:r>
+          </w:p>
+        </w:tc>
+      </w:tr>
+      <w:tr>
+        <w:tc>
+          <w:tcPr>
+            <w:tcW w:type="dxa" w:w="6000"/>
+            <w:tcMar>
+              <w:top w:type="dxa" w:w="60"/>
+              <w:left w:type="dxa" w:w="100"/>
+              <w:bottom w:type="dxa" w:w="60"/>
+              <w:right w:type="dxa" w:w="100"/>
+            </w:tcMar>
+          </w:tcPr>
+          <w:p>
+            <w:r>
+              <w:rPr>
+                <w:rFonts w:ascii="Calibri" w:cs="Calibri" w:eastAsia="Calibri" w:hAnsi="Calibri"/>
+                <w:b w:val="false"/>
+                <w:bCs w:val="false"/>
+                <w:sz w:val="19"/>
+                <w:szCs w:val="19"/>
+              </w:rPr>
+              <w:t xml:space="preserve">SeatGeek game snapshots (hourly, every listed game)</w:t>
+            </w:r>
+          </w:p>
+        </w:tc>
+        <w:tc>
+          <w:tcPr>
+            <w:tcW w:type="dxa" w:w="3360"/>
+            <w:tcMar>
+              <w:top w:type="dxa" w:w="60"/>
+              <w:left w:type="dxa" w:w="100"/>
+              <w:bottom w:type="dxa" w:w="60"/>
+              <w:right w:type="dxa" w:w="100"/>
+            </w:tcMar>
+          </w:tcPr>
+          <w:p>
+            <w:r>
+              <w:rPr>
+                <w:rFonts w:ascii="Calibri" w:cs="Calibri" w:eastAsia="Calibri" w:hAnsi="Calibri"/>
+                <w:b w:val="false"/>
+                <w:bCs w:val="false"/>
+                <w:sz w:val="19"/>
+                <w:szCs w:val="19"/>
+              </w:rPr>
+              <w:t xml:space="preserve">40,813</w:t>
+            </w:r>
+          </w:p>
+        </w:tc>
+      </w:tr>
+      <w:tr>
+        <w:tc>
+          <w:tcPr>
+            <w:tcW w:type="dxa" w:w="6000"/>
+            <w:tcMar>
+              <w:top w:type="dxa" w:w="60"/>
+              <w:left w:type="dxa" w:w="100"/>
+              <w:bottom w:type="dxa" w:w="60"/>
+              <w:right w:type="dxa" w:w="100"/>
+            </w:tcMar>
+          </w:tcPr>
+          <w:p>
+            <w:r>
+              <w:rPr>
+                <w:rFonts w:ascii="Calibri" w:cs="Calibri" w:eastAsia="Calibri" w:hAnsi="Calibri"/>
+                <w:b w:val="false"/>
+                <w:bCs w:val="false"/>
+                <w:sz w:val="19"/>
+                <w:szCs w:val="19"/>
+              </w:rPr>
+              <w:t xml:space="preserve">Ticketmaster status rows</w:t>
+            </w:r>
+          </w:p>
+        </w:tc>
+        <w:tc>
+          <w:tcPr>
+            <w:tcW w:type="dxa" w:w="3360"/>
+            <w:tcMar>
+              <w:top w:type="dxa" w:w="60"/>
+              <w:left w:type="dxa" w:w="100"/>
+              <w:bottom w:type="dxa" w:w="60"/>
+              <w:right w:type="dxa" w:w="100"/>
+            </w:tcMar>
+          </w:tcPr>
+          <w:p>
+            <w:r>
+              <w:rPr>
+                <w:rFonts w:ascii="Calibri" w:cs="Calibri" w:eastAsia="Calibri" w:hAnsi="Calibri"/>
+                <w:b w:val="false"/>
+                <w:bCs w:val="false"/>
+                <w:sz w:val="19"/>
+                <w:szCs w:val="19"/>
+              </w:rPr>
+              <w:t xml:space="preserve">25,364</w:t>
+            </w:r>
+          </w:p>
+        </w:tc>
+      </w:tr>
+      <w:tr>
+        <w:tc>
+          <w:tcPr>
+            <w:tcW w:type="dxa" w:w="6000"/>
+            <w:tcMar>
+              <w:top w:type="dxa" w:w="60"/>
+              <w:left w:type="dxa" w:w="100"/>
+              <w:bottom w:type="dxa" w:w="60"/>
+              <w:right w:type="dxa" w:w="100"/>
+            </w:tcMar>
+          </w:tcPr>
+          <w:p>
+            <w:r>
+              <w:rPr>
+                <w:rFonts w:ascii="Calibri" w:cs="Calibri" w:eastAsia="Calibri" w:hAnsi="Calibri"/>
+                <w:b w:val="false"/>
+                <w:bCs w:val="false"/>
+                <w:sz w:val="19"/>
+                <w:szCs w:val="19"/>
+              </w:rPr>
+              <w:t xml:space="preserve">Postseason games with full price curves</w:t>
+            </w:r>
+          </w:p>
+        </w:tc>
+        <w:tc>
+          <w:tcPr>
+            <w:tcW w:type="dxa" w:w="3360"/>
+            <w:tcMar>
+              <w:top w:type="dxa" w:w="60"/>
+              <w:left w:type="dxa" w:w="100"/>
+              <w:bottom w:type="dxa" w:w="60"/>
+              <w:right w:type="dxa" w:w="100"/>
+            </w:tcMar>
+          </w:tcPr>
+          <w:p>
+            <w:r>
+              <w:rPr>
+                <w:rFonts w:ascii="Calibri" w:cs="Calibri" w:eastAsia="Calibri" w:hAnsi="Calibri"/>
+                <w:b w:val="false"/>
+                <w:bCs w:val="false"/>
+                <w:sz w:val="19"/>
+                <w:szCs w:val="19"/>
+              </w:rPr>
+              <w:t xml:space="preserve">74</w:t>
+            </w:r>
+          </w:p>
+        </w:tc>
+      </w:tr>
+      <w:tr>
+        <w:tc>
+          <w:tcPr>
+            <w:tcW w:type="dxa" w:w="6000"/>
+            <w:tcMar>
+              <w:top w:type="dxa" w:w="60"/>
+              <w:left w:type="dxa" w:w="100"/>
+              <w:bottom w:type="dxa" w:w="60"/>
+              <w:right w:type="dxa" w:w="100"/>
+            </w:tcMar>
+          </w:tcPr>
+          <w:p>
+            <w:r>
+              <w:rPr>
+                <w:rFonts w:ascii="Calibri" w:cs="Calibri" w:eastAsia="Calibri" w:hAnsi="Calibri"/>
+                <w:b w:val="false"/>
+                <w:bCs w:val="false"/>
+                <w:sz w:val="19"/>
+                <w:szCs w:val="19"/>
+              </w:rPr>
+              <w:t xml:space="preserve">Completed series</w:t>
+            </w:r>
+          </w:p>
+        </w:tc>
+        <w:tc>
+          <w:tcPr>
+            <w:tcW w:type="dxa" w:w="3360"/>
+            <w:tcMar>
+              <w:top w:type="dxa" w:w="60"/>
+              <w:left w:type="dxa" w:w="100"/>
+              <w:bottom w:type="dxa" w:w="60"/>
+              <w:right w:type="dxa" w:w="100"/>
+            </w:tcMar>
+          </w:tcPr>
+          <w:p>
+            <w:r>
+              <w:rPr>
+                <w:rFonts w:ascii="Calibri" w:cs="Calibri" w:eastAsia="Calibri" w:hAnsi="Calibri"/>
+                <w:b w:val="false"/>
+                <w:bCs w:val="false"/>
+                <w:sz w:val="19"/>
+                <w:szCs w:val="19"/>
+              </w:rPr>
+              <w:t xml:space="preserve">11 (plus the World Series in progress)</w:t>
+            </w:r>
+          </w:p>
+        </w:tc>
+      </w:tr>
+      <w:tr>
+        <w:tc>
+          <w:tcPr>
+            <w:tcW w:type="dxa" w:w="6000"/>
+            <w:tcMar>
+              <w:top w:type="dxa" w:w="60"/>
+              <w:left w:type="dxa" w:w="100"/>
+              <w:bottom w:type="dxa" w:w="60"/>
+              <w:right w:type="dxa" w:w="100"/>
+            </w:tcMar>
+          </w:tcPr>
+          <w:p>
+            <w:r>
+              <w:rPr>
+                <w:rFonts w:ascii="Calibri" w:cs="Calibri" w:eastAsia="Calibri" w:hAnsi="Calibri"/>
+                <w:b w:val="false"/>
+                <w:bCs w:val="false"/>
+                <w:sz w:val="19"/>
+                <w:szCs w:val="19"/>
+              </w:rPr>
+              <w:t xml:space="preserve">Hand-logged results</w:t>
+            </w:r>
+          </w:p>
+        </w:tc>
+        <w:tc>
+          <w:tcPr>
+            <w:tcW w:type="dxa" w:w="3360"/>
+            <w:tcMar>
+              <w:top w:type="dxa" w:w="60"/>
+              <w:left w:type="dxa" w:w="100"/>
+              <w:bottom w:type="dxa" w:w="60"/>
+              <w:right w:type="dxa" w:w="100"/>
+            </w:tcMar>
+          </w:tcPr>
+          <w:p>
+            <w:r>
+              <w:rPr>
+                <w:rFonts w:ascii="Calibri" w:cs="Calibri" w:eastAsia="Calibri" w:hAnsi="Calibri"/>
+                <w:b w:val="false"/>
+                <w:bCs w:val="false"/>
+                <w:sz w:val="19"/>
+                <w:szCs w:val="19"/>
+              </w:rPr>
+              <w:t xml:space="preserve">46</w:t>
+            </w:r>
+          </w:p>
+        </w:tc>
+      </w:tr>
+      <w:tr>
+        <w:tc>
+          <w:tcPr>
+            <w:tcW w:type="dxa" w:w="6000"/>
+            <w:tcMar>
+              <w:top w:type="dxa" w:w="60"/>
+              <w:left w:type="dxa" w:w="100"/>
+              <w:bottom w:type="dxa" w:w="60"/>
+              <w:right w:type="dxa" w:w="100"/>
+            </w:tcMar>
+          </w:tcPr>
+          <w:p>
+            <w:r>
+              <w:rPr>
+                <w:rFonts w:ascii="Calibri" w:cs="Calibri" w:eastAsia="Calibri" w:hAnsi="Calibri"/>
+                <w:b w:val="false"/>
+                <w:bCs w:val="false"/>
+                <w:sz w:val="19"/>
+                <w:szCs w:val="19"/>
+              </w:rPr>
+              <w:t xml:space="preserve">Size</w:t>
+            </w:r>
+          </w:p>
+        </w:tc>
+        <w:tc>
+          <w:tcPr>
+            <w:tcW w:type="dxa" w:w="3360"/>
+            <w:tcMar>
+              <w:top w:type="dxa" w:w="60"/>
+              <w:left w:type="dxa" w:w="100"/>
+              <w:bottom w:type="dxa" w:w="60"/>
+              <w:right w:type="dxa" w:w="100"/>
+            </w:tcMar>
+          </w:tcPr>
+          <w:p>
+            <w:r>
+              <w:rPr>
+                <w:rFonts w:ascii="Calibri" w:cs="Calibri" w:eastAsia="Calibri" w:hAnsi="Calibri"/>
+                <w:b w:val="false"/>
+                <w:bCs w:val="false"/>
+                <w:sz w:val="19"/>
+                <w:szCs w:val="19"/>
+              </w:rPr>
+              <w:t xml:space="preserve">234 MB, all on GitHub</w:t>
+            </w:r>
+          </w:p>
+        </w:tc>
+      </w:tr>
+    </w:tbl>
+    <w:p>
+      <w:pPr>
+        <w:pStyle w:val="Heading2"/>
+        <w:spacing w:after="60" w:before="200"/>
+      </w:pPr>
+      <w:r>
+        <w:rPr>
+          <w:rFonts w:ascii="Calibri" w:cs="Calibri" w:eastAsia="Calibri" w:hAnsi="Calibri"/>
+          <w:color w:val="C9962B"/>
+        </w:rPr>
+        <w:t xml:space="preserve">Why that is enough</w:t>
+      </w:r>
+    </w:p>
+    <w:p>
+      <w:pPr>
+        <w:spacing w:after="80"/>
+      </w:pPr>
+      <w:r>
+        <w:rPr>
+          <w:rFonts w:ascii="Calibri" w:cs="Calibri" w:eastAsia="Calibri" w:hAnsi="Calibri"/>
+          <w:sz w:val="21"/>
+          <w:szCs w:val="21"/>
+        </w:rPr>
+        <w:t xml:space="preserve">The project’s questions are answered by comparing series, and there are eleven complete ones across three rounds. The World Series is one more, and an unusual one. Losing its last games costs a footnote, not a finding. The limit was never data; it was my time to analyze it, which is now deferred on purpose. A clean, documented ‘collected Sep 28 – Oct 27’ beats a ragged one.</w:t>
+      </w:r>
+    </w:p>
+    <w:p>
+      <w:pPr>
+        <w:pStyle w:val="Heading2"/>
+        <w:spacing w:after="60" w:before="200"/>
+      </w:pPr>
+      <w:r>
+        <w:rPr>
+          <w:rFonts w:ascii="Calibri" w:cs="Calibri" w:eastAsia="Calibri" w:hAnsi="Calibri"/>
+          <w:color w:val="C9962B"/>
+        </w:rPr>
+        <w:t xml:space="preserve">What happens next</w:t>
+      </w:r>
+    </w:p>
+    <w:p>
+      <w:pPr>
+        <w:pStyle w:val="ListParagraph"/>
+        <w:numPr>
+          <w:ilvl w:val="0"/>
+          <w:numId w:val="2"/>
+        </w:numPr>
+        <w:spacing w:after="40"/>
+      </w:pPr>
+      <w:r>
+        <w:rPr>
+          <w:rFonts w:ascii="Calibri" w:cs="Calibri" w:eastAsia="Calibri" w:hAnsi="Calibri"/>
+          <w:sz w:val="21"/>
+          <w:szCs w:val="21"/>
+        </w:rPr>
+        <w:t xml:space="preserve">Oct 28: the hourly job switches to snapshots-only so it stops attempting captures.</w:t>
+      </w:r>
+    </w:p>
+    <w:p>
+      <w:pPr>
+        <w:pStyle w:val="ListParagraph"/>
+        <w:numPr>
+          <w:ilvl w:val="0"/>
+          <w:numId w:val="2"/>
+        </w:numPr>
+        <w:spacing w:after="40"/>
+      </w:pPr>
+      <w:r>
+        <w:rPr>
+          <w:rFonts w:ascii="Calibri" w:cs="Calibri" w:eastAsia="Calibri" w:hAnsi="Calibri"/>
+          <w:sz w:val="21"/>
+          <w:szCs w:val="21"/>
+        </w:rPr>
+        <w:t xml:space="preserve">After the last World Series game: close-out. Final results rows, refreshed workbook, a README stating exactly what the dataset is, its date range and its limits. Then it sits on GitHub, finished.</w:t>
+      </w:r>
+    </w:p>
+    <w:p>
+      <w:pPr>
+        <w:pStyle w:val="ListParagraph"/>
+        <w:numPr>
+          <w:ilvl w:val="0"/>
+          <w:numId w:val="2"/>
+        </w:numPr>
+        <w:spacing w:after="40"/>
+      </w:pPr>
+      <w:r>
+        <w:rPr>
+          <w:rFonts w:ascii="Calibri" w:cs="Calibri" w:eastAsia="Calibri" w:hAnsi="Calibri"/>
+          <w:sz w:val="21"/>
+          <w:szCs w:val="21"/>
+        </w:rPr>
+        <w:t xml:space="preserve">When I come back with SQL: the entry point is python3 analysis/run_all.py. Seven questions, already answered, waiting for me to argue with them.</w:t>
       </w:r>
     </w:p>
     <w:sectPr>

</xml_diff>